<commit_message>
Link dashboard from README and report
</commit_message>
<xml_diff>
--- a/reporte/Reporte_Tecnico_Evaluacion_Validacion.docx
+++ b/reporte/Reporte_Tecnico_Evaluacion_Validacion.docx
@@ -40,6 +40,23 @@
       <w:r>
         <w:t>Dataset: Twitter US Airline Sentiment</w:t>
       </w:r>
+    </w:p>
+    <w:p>
+      <w:pPr>
+        <w:jc w:val="center"/>
+      </w:pPr>
+      <w:r>
+        <w:t xml:space="preserve">Tablero visual de resultados: </w:t>
+      </w:r>
+      <w:hyperlink r:id="rId9">
+        <w:r>
+          <w:rPr>
+            <w:color w:val="0563C1"/>
+            <w:u w:val="single"/>
+          </w:rPr>
+          <w:t>Abrir tablero en línea</w:t>
+        </w:r>
+      </w:hyperlink>
     </w:p>
     <w:p>
       <w:r>
@@ -710,7 +727,7 @@
                     <pic:cNvPicPr/>
                   </pic:nvPicPr>
                   <pic:blipFill>
-                    <a:blip r:embed="rId9"/>
+                    <a:blip r:embed="rId10"/>
                     <a:stretch>
                       <a:fillRect/>
                     </a:stretch>
@@ -1172,7 +1189,7 @@
                     <pic:cNvPicPr/>
                   </pic:nvPicPr>
                   <pic:blipFill>
-                    <a:blip r:embed="rId10"/>
+                    <a:blip r:embed="rId11"/>
                     <a:stretch>
                       <a:fillRect/>
                     </a:stretch>
@@ -1494,7 +1511,7 @@
                     <pic:cNvPicPr/>
                   </pic:nvPicPr>
                   <pic:blipFill>
-                    <a:blip r:embed="rId11"/>
+                    <a:blip r:embed="rId12"/>
                     <a:stretch>
                       <a:fillRect/>
                     </a:stretch>
@@ -2322,7 +2339,7 @@
                     <pic:cNvPicPr/>
                   </pic:nvPicPr>
                   <pic:blipFill>
-                    <a:blip r:embed="rId12"/>
+                    <a:blip r:embed="rId13"/>
                     <a:stretch>
                       <a:fillRect/>
                     </a:stretch>
@@ -2502,7 +2519,7 @@
                     <pic:cNvPicPr/>
                   </pic:nvPicPr>
                   <pic:blipFill>
-                    <a:blip r:embed="rId13"/>
+                    <a:blip r:embed="rId14"/>
                     <a:stretch>
                       <a:fillRect/>
                     </a:stretch>

</xml_diff>